<commit_message>
Update presentation and walkthrough with interactive REST API and User Dashboards
</commit_message>
<xml_diff>
--- a/Docs/System_Walkthrough.docx
+++ b/Docs/System_Walkthrough.docx
@@ -316,6 +316,119 @@
       <w:pPr>
         <w:spacing w:after="240"/>
       </w:pPr>
+    </w:p>
+    <w:p>
+      <w:r>
+        <w:rPr>
+          <w:rFonts w:ascii="Arial" w:hAnsi="Arial"/>
+          <w:b/>
+          <w:sz w:val="32"/>
+        </w:rPr>
+        <w:t>Phase 3: Interactive System Dashboards</w:t>
+      </w:r>
+    </w:p>
+    <w:p>
+      <w:r>
+        <w:drawing>
+          <wp:inline xmlns:a="http://schemas.openxmlformats.org/drawingml/2006/main" xmlns:pic="http://schemas.openxmlformats.org/drawingml/2006/picture">
+            <wp:extent cx="5029200" cy="2828925"/>
+            <wp:docPr id="4" name="Picture 4"/>
+            <wp:cNvGraphicFramePr>
+              <a:graphicFrameLocks noChangeAspect="1"/>
+            </wp:cNvGraphicFramePr>
+            <a:graphic>
+              <a:graphicData uri="http://schemas.openxmlformats.org/drawingml/2006/picture">
+                <pic:pic>
+                  <pic:nvPicPr>
+                    <pic:cNvPr id="0" name="rest_api_dashboard.png"/>
+                    <pic:cNvPicPr/>
+                  </pic:nvPicPr>
+                  <pic:blipFill>
+                    <a:blip r:embed="rId12"/>
+                    <a:stretch>
+                      <a:fillRect/>
+                    </a:stretch>
+                  </pic:blipFill>
+                  <pic:spPr>
+                    <a:xfrm>
+                      <a:off x="0" y="0"/>
+                      <a:ext cx="5029200" cy="2828925"/>
+                    </a:xfrm>
+                    <a:prstGeom prst="rect"/>
+                  </pic:spPr>
+                </pic:pic>
+              </a:graphicData>
+            </a:graphic>
+          </wp:inline>
+        </w:drawing>
+      </w:r>
+    </w:p>
+    <w:p>
+      <w:pPr>
+        <w:jc w:val="center"/>
+      </w:pPr>
+      <w:r>
+        <w:rPr>
+          <w:rFonts w:ascii="Arial" w:hAnsi="Arial"/>
+          <w:i/>
+          <w:sz w:val="20"/>
+        </w:rPr>
+        <w:t>Figure 4: Interactive REST API dashboard (FastAPI Swagger interface) detailing core system emergency endpoints.</w:t>
+      </w:r>
+    </w:p>
+    <w:p>
+      <w:pPr>
+        <w:spacing w:after="240"/>
+      </w:pPr>
+    </w:p>
+    <w:p>
+      <w:r>
+        <w:drawing>
+          <wp:inline xmlns:a="http://schemas.openxmlformats.org/drawingml/2006/main" xmlns:pic="http://schemas.openxmlformats.org/drawingml/2006/picture">
+            <wp:extent cx="5029200" cy="2828925"/>
+            <wp:docPr id="5" name="Picture 5"/>
+            <wp:cNvGraphicFramePr>
+              <a:graphicFrameLocks noChangeAspect="1"/>
+            </wp:cNvGraphicFramePr>
+            <a:graphic>
+              <a:graphicData uri="http://schemas.openxmlformats.org/drawingml/2006/picture">
+                <pic:pic>
+                  <pic:nvPicPr>
+                    <pic:cNvPr id="0" name="user_dashboard.png"/>
+                    <pic:cNvPicPr/>
+                  </pic:nvPicPr>
+                  <pic:blipFill>
+                    <a:blip r:embed="rId13"/>
+                    <a:stretch>
+                      <a:fillRect/>
+                    </a:stretch>
+                  </pic:blipFill>
+                  <pic:spPr>
+                    <a:xfrm>
+                      <a:off x="0" y="0"/>
+                      <a:ext cx="5029200" cy="2828925"/>
+                    </a:xfrm>
+                    <a:prstGeom prst="rect"/>
+                  </pic:spPr>
+                </pic:pic>
+              </a:graphicData>
+            </a:graphic>
+          </wp:inline>
+        </w:drawing>
+      </w:r>
+    </w:p>
+    <w:p>
+      <w:pPr>
+        <w:jc w:val="center"/>
+      </w:pPr>
+      <w:r>
+        <w:rPr>
+          <w:rFonts w:ascii="Arial" w:hAnsi="Arial"/>
+          <w:i/>
+          <w:sz w:val="20"/>
+        </w:rPr>
+        <w:t>Figure 5: RoadSOS User Driver Dashboard displaying active armed state and real-time inertial telemetry.</w:t>
+      </w:r>
     </w:p>
     <w:sectPr>
       <w:pgSz w:w="12240" w:h="15840"/>

</xml_diff>